<commit_message>
Fix design and performance findings (D3–D6, D9, F7)
- Contrast: course lesson nav, checklist header, DC guide summaries, RMF
  module labels pass WCAG AA; privacy links are underlined.
- Training Library tile labels 11–12px; kickers fit on one line.
- three.js minified in place (2.17 MB → 0.78 MB for the model; DC guide
  3.3 MB → 1.4 MB); the homepage shader loads after idle and is skipped for
  reduced motion and Save-Data.
- Layout shift: My Account reserves space while loading; the DC guide
  reserves its account panel (CLS → 0).
- DC01/DC02 and RMF guides get the site tagline, Home and My Account links,
  icons and canonical links; DC package text, workbook metadata and alt text
  fixed; package manifest and ZIP rebuilt.
- Retired public files moved to archive/public-retired-2026-10-08.

Co-Authored-By: Claude Opus 5.5 <noreply@anthropic.com>
Claude-Session: https://claude.ai/code/session_019wopQQuPwG5CcFGYaGF73Y
</commit_message>
<xml_diff>
--- a/public/training/dc01-dc02/SecureByDesign-DC01-DC02-Workbook.docx
+++ b/public/training/dc01-dc02/SecureByDesign-DC01-DC02-Workbook.docx
@@ -7,7 +7,7 @@
         <w:drawing>
           <wp:inline xmlns:a="http://schemas.openxmlformats.org/drawingml/2006/main" xmlns:pic="http://schemas.openxmlformats.org/drawingml/2006/picture">
             <wp:extent cx="502920" cy="502920"/>
-            <wp:docPr id="1" name="SBD figure 1"/>
+            <wp:docPr id="1" name="SBD figure 1" descr="Secure By Design logo"/>
             <wp:cNvGraphicFramePr>
               <a:graphicFrameLocks noChangeAspect="1"/>
             </wp:cNvGraphicFramePr>
@@ -3640,7 +3640,7 @@
         <w:drawing>
           <wp:inline xmlns:a="http://schemas.openxmlformats.org/drawingml/2006/main" xmlns:pic="http://schemas.openxmlformats.org/drawingml/2006/picture">
             <wp:extent cx="6400800" cy="1965960"/>
-            <wp:docPr id="2" name="SBD figure 2"/>
+            <wp:docPr id="2" name="SBD figure 2" descr="Network state: SBD-DC01 (10.0.10.10) runs AD DS and DNS as the one directory service point; SBD-DC02 (10.0.10.11) is planned."/>
             <wp:cNvGraphicFramePr>
               <a:graphicFrameLocks noChangeAspect="1"/>
             </wp:cNvGraphicFramePr>
@@ -3876,7 +3876,7 @@
         <w:drawing>
           <wp:inline xmlns:a="http://schemas.openxmlformats.org/drawingml/2006/main" xmlns:pic="http://schemas.openxmlformats.org/drawingml/2006/picture">
             <wp:extent cx="6400800" cy="1965960"/>
-            <wp:docPr id="3" name="SBD figure 3"/>
+            <wp:docPr id="3" name="SBD figure 3" descr="Network state: SBD-DC01 (10.0.10.10) and SBD-DC02 (10.0.10.11) both run AD DS and DNS, with directory replication between them to verify after promotion."/>
             <wp:cNvGraphicFramePr>
               <a:graphicFrameLocks noChangeAspect="1"/>
             </wp:cNvGraphicFramePr>
@@ -4112,7 +4112,7 @@
         <w:drawing>
           <wp:inline xmlns:a="http://schemas.openxmlformats.org/drawingml/2006/main" xmlns:pic="http://schemas.openxmlformats.org/drawingml/2006/picture">
             <wp:extent cx="6400800" cy="1965960"/>
-            <wp:docPr id="4" name="SBD figure 4"/>
+            <wp:docPr id="4" name="SBD figure 4" descr="Network state: SBD-DC01 and SBD-DC02 both run AD DS and DNS with directory replication; query each DNS server explicitly."/>
             <wp:cNvGraphicFramePr>
               <a:graphicFrameLocks noChangeAspect="1"/>
             </wp:cNvGraphicFramePr>
@@ -4734,7 +4734,7 @@
           <w:rFonts w:ascii="Arial" w:hAnsi="Arial"/>
           <w:color w:val="526B7E"/>
         </w:rPr>
-        <w:t xml:space="preserve">The workbook and interactive companion use the same five chapters. Your final recording will supply the original screenshots and video timestamps. Read the current sources before adapting the sample to another environment.</w:t>
+        <w:t>The workbook and interactive companion use the same five chapters. The recorded walkthrough is coming soon. Read the current sources before adapting the sample to another environment.</w:t>
       </w:r>
     </w:p>
     <w:p>

</xml_diff>

<commit_message>
Tighten the DNS pointers and fix review findings
- 1.1: fold "leave it that way" into the prepare step and drop the extra
  DNS sentence from lesson 3; note the expected delegation warning in the
  promotion pointer; list FSMO holders with netdom query fsmo (the
  Get-ADDomainController role list truncates after four items); soften
  the IA-2 and model wording; refresh the Word description property.
- 1.2: make the DNS client-order block run from either controller with
  -CimSession, check replication first and the order afterwards; cite
  Install-ADDSForest for the loopback default; name the DomainDnsZones and
  ForestDnsZones partitions; say the capture needs an elevated window.
- Regenerate the workbooks, PDFs, checklist, guide data, command sheet,
  manifest and ZIP; update the 1.2 guide resource description.

Co-Authored-By: Claude Opus 5.5 <noreply@anthropic.com>
Claude-Session: https://claude.ai/code/session_019wopQQuPwG5CcFGYaGF73Y
</commit_message>
<xml_diff>
--- a/public/training/dc01-dc02/SecureByDesign-DC01-DC02-Workbook.docx
+++ b/public/training/dc01-dc02/SecureByDesign-DC01-DC02-Workbook.docx
@@ -2858,7 +2858,7 @@
                 <w:color w:val="193448"/>
                 <w:sz w:val="20"/>
               </w:rPr>
-              <w:t xml:space="preserve">10.0.10.10 (SBD-DC01); course 1.2 sets the final order</w:t>
+              <w:t xml:space="preserve">10.0.10.10 (SBD-DC01)</w:t>
             </w:r>
           </w:p>
         </w:tc>
@@ -3050,7 +3050,7 @@
         <w:rPr>
           <w:rFonts w:ascii="Arial" w:hAnsi="Arial"/>
         </w:rPr>
-        <w:t xml:space="preserve">2.  Promote the server using Add a new forest and sbd.test. Leave DNS server selected (course 1.2 explains it); the first controller is always a global catalog. Choose Windows Server 2025 functional levels and a unique DSRM password.</w:t>
+        <w:t xml:space="preserve">2.  Promote the server using Add a new forest and sbd.test. Leave DNS server selected; the DNS delegation warning is expected, and course 1.2 explains both. The first controller is always a global catalog. Choose Windows Server 2025 functional levels and a unique DSRM password.</w:t>
       </w:r>
     </w:p>
     <w:p>
@@ -3275,7 +3275,7 @@
         <w:rPr>
           <w:rFonts w:ascii="Arial" w:hAnsi="Arial"/>
         </w:rPr>
-        <w:t xml:space="preserve">1.  Point DC02 at DC01 (10.0.10.10) for DNS; course 1.2 explains the DNS design. Check network reachability and clock alignment.</w:t>
+        <w:t xml:space="preserve">1.  Point DC02 at DC01 (10.0.10.10) for DNS and leave it that way; course 1.2 explains the DNS design. Check network reachability and clock alignment.</w:t>
       </w:r>
     </w:p>
     <w:p>
@@ -3297,7 +3297,7 @@
         <w:rPr>
           <w:rFonts w:ascii="Arial" w:hAnsi="Arial"/>
         </w:rPr>
-        <w:t xml:space="preserve">3.  Review site, replication source, DSRM password, and prerequisites. Install and restart. Leave DC02's DNS setting as it is; course 1.2 sets the final order.</w:t>
+        <w:t xml:space="preserve">3.  Review site, replication source, DSRM password, and prerequisites. Install and restart.</w:t>
       </w:r>
     </w:p>
     <w:p>
@@ -3533,7 +3533,7 @@
         <w:rPr>
           <w:rFonts w:ascii="Arial" w:hAnsi="Arial"/>
         </w:rPr>
-        <w:t xml:space="preserve">3.  List both controllers' global catalog status and operations master roles; SBD-DC01 holds all five. Confirm SYSVOL and NETLOGON are shared on SBD-DC02 too.</w:t>
+        <w:t xml:space="preserve">3.  List both controllers' global catalog status and the operations master role holders; SBD-DC01 holds all five. Confirm SYSVOL and NETLOGON are shared on SBD-DC02 too.</w:t>
       </w:r>
     </w:p>
     <w:p>
@@ -3617,9 +3617,9 @@
         <w:br/>
         <w:t xml:space="preserve">repadmin /showrepl *</w:t>
         <w:br/>
-        <w:t xml:space="preserve">Get-ADDomainController -Filter * |</w:t>
+        <w:t xml:space="preserve">Get-ADDomainController -Filter * | Select-Object HostName, IsGlobalCatalog</w:t>
         <w:br/>
-        <w:t xml:space="preserve">  Select-Object HostName, IsGlobalCatalog, OperationMasterRoles</w:t>
+        <w:t xml:space="preserve">netdom query fsmo</w:t>
         <w:br/>
         <w:t xml:space="preserve">Get-SmbShare -Name SYSVOL,NETLOGON -CimSession SBD-DC02</w:t>
       </w:r>
@@ -3655,7 +3655,7 @@
           <w:color w:val="526B7E"/>
           <w:sz w:val="22"/>
         </w:rPr>
-        <w:t xml:space="preserve">Healthy, replicating controllers make domain sign-in possible. These checks do not establish all authentication requirements.</w:t>
+        <w:t xml:space="preserve">Healthy, replicating controllers are a precondition for domain sign-in. These checks do not establish all authentication requirements.</w:t>
       </w:r>
     </w:p>
     <w:p>

</xml_diff>